<commit_message>
Pinout checking, bridging audio testboard and main board
</commit_message>
<xml_diff>
--- a/HW/README_pedalboard_hw.docx
+++ b/HW/README_pedalboard_hw.docx
@@ -1,13 +1,602 @@
 
 <file path=word/document.xml><?xml version="1.0" encoding="utf-8"?>
-<w:document xmlns:wpc="http://schemas.microsoft.com/office/word/2010/wordprocessingCanvas" xmlns:cx="http://schemas.microsoft.com/office/drawing/2014/chartex" xmlns:cx1="http://schemas.microsoft.com/office/drawing/2015/9/8/chartex" xmlns:cx2="http://schemas.microsoft.com/office/drawing/2015/10/21/chartex" xmlns:cx3="http://schemas.microsoft.com/office/drawing/2016/5/9/chartex" xmlns:cx4="http://schemas.microsoft.com/office/drawing/2016/5/10/chartex" xmlns:cx5="http://schemas.microsoft.com/office/drawing/2016/5/11/chartex" xmlns:cx6="http://schemas.microsoft.com/office/drawing/2016/5/12/chartex" xmlns:cx7="http://schemas.microsoft.com/office/drawing/2016/5/13/chartex" xmlns:cx8="http://schemas.microsoft.com/office/drawing/2016/5/14/chartex" xmlns:mc="http://schemas.openxmlformats.org/markup-compatibility/2006" xmlns:aink="http://schemas.microsoft.com/office/drawing/2016/ink" xmlns:am3d="http://schemas.microsoft.com/office/drawing/2017/model3d" xmlns:o="urn:schemas-microsoft-com:office:office" xmlns:r="http://schemas.openxmlformats.org/officeDocument/2006/relationships" xmlns:m="http://schemas.openxmlformats.org/officeDocument/2006/math" xmlns:v="urn:schemas-microsoft-com:vml" xmlns:wp14="http://schemas.microsoft.com/office/word/2010/wordprocessingDrawing" xmlns:wp="http://schemas.openxmlformats.org/drawingml/2006/wordprocessingDrawing" xmlns:w10="urn:schemas-microsoft-com:office:word" xmlns:w="http://schemas.openxmlformats.org/wordprocessingml/2006/main" xmlns:w14="http://schemas.microsoft.com/office/word/2010/wordml" xmlns:w15="http://schemas.microsoft.com/office/word/2012/wordml" xmlns:w16cex="http://schemas.microsoft.com/office/word/2018/wordml/cex" xmlns:w16cid="http://schemas.microsoft.com/office/word/2016/wordml/cid" xmlns:w16="http://schemas.microsoft.com/office/word/2018/wordml" xmlns:w16sdtdh="http://schemas.microsoft.com/office/word/2020/wordml/sdtdatahash" xmlns:w16se="http://schemas.microsoft.com/office/word/2015/wordml/symex" xmlns:wpg="http://schemas.microsoft.com/office/word/2010/wordprocessingGroup" xmlns:wpi="http://schemas.microsoft.com/office/word/2010/wordprocessingInk" xmlns:wne="http://schemas.microsoft.com/office/word/2006/wordml" xmlns:wps="http://schemas.microsoft.com/office/word/2010/wordprocessingShape" mc:Ignorable="w14 w15 w16se w16cid w16 w16cex w16sdtdh wp14">
+<w:document xmlns:wpc="http://schemas.microsoft.com/office/word/2010/wordprocessingCanvas" xmlns:cx="http://schemas.microsoft.com/office/drawing/2014/chartex" xmlns:cx1="http://schemas.microsoft.com/office/drawing/2015/9/8/chartex" xmlns:cx2="http://schemas.microsoft.com/office/drawing/2015/10/21/chartex" xmlns:cx3="http://schemas.microsoft.com/office/drawing/2016/5/9/chartex" xmlns:cx4="http://schemas.microsoft.com/office/drawing/2016/5/10/chartex" xmlns:cx5="http://schemas.microsoft.com/office/drawing/2016/5/11/chartex" xmlns:cx6="http://schemas.microsoft.com/office/drawing/2016/5/12/chartex" xmlns:cx7="http://schemas.microsoft.com/office/drawing/2016/5/13/chartex" xmlns:cx8="http://schemas.microsoft.com/office/drawing/2016/5/14/chartex" xmlns:mc="http://schemas.openxmlformats.org/markup-compatibility/2006" xmlns:aink="http://schemas.microsoft.com/office/drawing/2016/ink" xmlns:am3d="http://schemas.microsoft.com/office/drawing/2017/model3d" xmlns:o="urn:schemas-microsoft-com:office:office" xmlns:oel="http://schemas.microsoft.com/office/2019/extlst" xmlns:r="http://schemas.openxmlformats.org/officeDocument/2006/relationships" xmlns:m="http://schemas.openxmlformats.org/officeDocument/2006/math" xmlns:v="urn:schemas-microsoft-com:vml" xmlns:wp14="http://schemas.microsoft.com/office/word/2010/wordprocessingDrawing" xmlns:wp="http://schemas.openxmlformats.org/drawingml/2006/wordprocessingDrawing" xmlns:w10="urn:schemas-microsoft-com:office:word" xmlns:w="http://schemas.openxmlformats.org/wordprocessingml/2006/main" xmlns:w14="http://schemas.microsoft.com/office/word/2010/wordml" xmlns:w15="http://schemas.microsoft.com/office/word/2012/wordml" xmlns:w16cex="http://schemas.microsoft.com/office/word/2018/wordml/cex" xmlns:w16cid="http://schemas.microsoft.com/office/word/2016/wordml/cid" xmlns:w16="http://schemas.microsoft.com/office/word/2018/wordml" xmlns:w16du="http://schemas.microsoft.com/office/word/2023/wordml/word16du" xmlns:w16sdtdh="http://schemas.microsoft.com/office/word/2020/wordml/sdtdatahash" xmlns:w16sdtfl="http://schemas.microsoft.com/office/word/2024/wordml/sdtformatlock" xmlns:w16se="http://schemas.microsoft.com/office/word/2015/wordml/symex" xmlns:wpg="http://schemas.microsoft.com/office/word/2010/wordprocessingGroup" xmlns:wpi="http://schemas.microsoft.com/office/word/2010/wordprocessingInk" xmlns:wne="http://schemas.microsoft.com/office/word/2006/wordml" xmlns:wps="http://schemas.microsoft.com/office/word/2010/wordprocessingShape" mc:Ignorable="w14 w15 w16se w16cid w16 w16cex w16sdtdh w16sdtfl w16du wp14">
   <w:body>
     <w:p>
       <w:pPr>
-        <w:pStyle w:val="ListParagraph"/>
-        <w:rPr>
-          <w:lang w:val="en-US"/>
-        </w:rPr>
+        <w:pStyle w:val="a3"/>
+        <w:rPr>
+          <w:lang w:val="en-US"/>
+        </w:rPr>
+      </w:pPr>
+      <w:r>
+        <w:rPr>
+          <w:lang w:val="en-US"/>
+        </w:rPr>
+        <w:t>Actual pinouts are:</w:t>
+      </w:r>
+    </w:p>
+    <w:p>
+      <w:pPr>
+        <w:pStyle w:val="a3"/>
+        <w:rPr>
+          <w:lang w:val="en-US"/>
+        </w:rPr>
+      </w:pPr>
+      <w:r>
+        <w:rPr>
+          <w:lang w:val="en-US"/>
+        </w:rPr>
+        <w:t>\HW\_Docs\</w:t>
+      </w:r>
+      <w:r>
+        <w:rPr>
+          <w:lang w:val="en-US"/>
+        </w:rPr>
+        <w:t xml:space="preserve"> </w:t>
+      </w:r>
+      <w:r>
+        <w:rPr>
+          <w:lang w:val="en-US"/>
+        </w:rPr>
+        <w:t>_AUDIO_PINOUT</w:t>
+      </w:r>
+    </w:p>
+    <w:p>
+      <w:pPr>
+        <w:pStyle w:val="a3"/>
+        <w:rPr>
+          <w:lang w:val="en-US"/>
+        </w:rPr>
+      </w:pPr>
+      <w:r>
+        <w:rPr>
+          <w:lang w:val="en-US"/>
+        </w:rPr>
+        <w:t>\HW\_Docs\_GUI_PINOUT</w:t>
+      </w:r>
+    </w:p>
+    <w:p>
+      <w:pPr>
+        <w:pStyle w:val="a3"/>
+        <w:rPr>
+          <w:lang w:val="en-US"/>
+        </w:rPr>
+      </w:pPr>
+    </w:p>
+    <w:p>
+      <w:pPr>
+        <w:pStyle w:val="a3"/>
+      </w:pPr>
+      <w:r>
+        <w:t>Мы поняли, что у нас:</w:t>
+      </w:r>
+    </w:p>
+    <w:p>
+      <w:pPr>
+        <w:pStyle w:val="a3"/>
+        <w:numPr>
+          <w:ilvl w:val="0"/>
+          <w:numId w:val="3"/>
+        </w:numPr>
+      </w:pPr>
+      <w:r>
+        <w:t>По 2 плашки 512 мегабит ОЗУ (128 мегабайт</w:t>
+      </w:r>
+      <w:r>
+        <w:t xml:space="preserve"> в сумме</w:t>
+      </w:r>
+      <w:r>
+        <w:t>)</w:t>
+      </w:r>
+      <w:r>
+        <w:t xml:space="preserve"> на каждом </w:t>
+      </w:r>
+      <w:proofErr w:type="spellStart"/>
+      <w:r>
+        <w:t>мк</w:t>
+      </w:r>
+      <w:proofErr w:type="spellEnd"/>
+    </w:p>
+    <w:p>
+      <w:pPr>
+        <w:pStyle w:val="a3"/>
+        <w:numPr>
+          <w:ilvl w:val="0"/>
+          <w:numId w:val="3"/>
+        </w:numPr>
+      </w:pPr>
+      <w:r>
+        <w:t>Из них где-то 25 мегабайт – активн</w:t>
+      </w:r>
+      <w:r>
+        <w:t>ый размер</w:t>
+      </w:r>
+      <w:r>
+        <w:t xml:space="preserve"> </w:t>
+      </w:r>
+      <w:proofErr w:type="spellStart"/>
+      <w:r>
+        <w:t>лупера</w:t>
+      </w:r>
+      <w:proofErr w:type="spellEnd"/>
+      <w:r>
+        <w:t xml:space="preserve"> для сохранения на </w:t>
+      </w:r>
+      <w:proofErr w:type="spellStart"/>
+      <w:r>
+        <w:t>сд</w:t>
+      </w:r>
+      <w:proofErr w:type="spellEnd"/>
+      <w:r>
+        <w:t>-карту</w:t>
+      </w:r>
+      <w:r>
+        <w:t xml:space="preserve"> (</w:t>
+      </w:r>
+      <w:r>
+        <w:rPr>
+          <w:lang w:val="en-US"/>
+        </w:rPr>
+        <w:t>x</w:t>
+      </w:r>
+      <w:r>
+        <w:t xml:space="preserve">2 </w:t>
+      </w:r>
+      <w:r>
+        <w:t xml:space="preserve">на </w:t>
+      </w:r>
+      <w:r>
+        <w:rPr>
+          <w:lang w:val="en-US"/>
+        </w:rPr>
+        <w:t>ctrl</w:t>
+      </w:r>
+      <w:r>
+        <w:t>+</w:t>
+      </w:r>
+      <w:r>
+        <w:rPr>
+          <w:lang w:val="en-US"/>
+        </w:rPr>
+        <w:t>z</w:t>
+      </w:r>
+      <w:r>
+        <w:t xml:space="preserve">, </w:t>
+      </w:r>
+      <w:r>
+        <w:t xml:space="preserve">и ещё </w:t>
+      </w:r>
+      <w:r>
+        <w:rPr>
+          <w:lang w:val="en-US"/>
+        </w:rPr>
+        <w:t>x</w:t>
+      </w:r>
+      <w:r>
+        <w:t xml:space="preserve">2 </w:t>
+      </w:r>
+      <w:r>
+        <w:t xml:space="preserve">для двух </w:t>
+      </w:r>
+      <w:proofErr w:type="spellStart"/>
+      <w:r>
+        <w:t>луперов</w:t>
+      </w:r>
+      <w:proofErr w:type="spellEnd"/>
+      <w:r>
+        <w:t xml:space="preserve"> – всего 100 мегабайт под </w:t>
+      </w:r>
+      <w:proofErr w:type="spellStart"/>
+      <w:r>
+        <w:t>лупер</w:t>
+      </w:r>
+      <w:proofErr w:type="spellEnd"/>
+      <w:r>
+        <w:t xml:space="preserve"> в ОЗУ</w:t>
+      </w:r>
+      <w:r>
+        <w:t>)</w:t>
+      </w:r>
+    </w:p>
+    <w:p>
+      <w:pPr>
+        <w:pStyle w:val="a3"/>
+        <w:numPr>
+          <w:ilvl w:val="0"/>
+          <w:numId w:val="3"/>
+        </w:numPr>
+      </w:pPr>
+      <w:r>
+        <w:t xml:space="preserve">Что даёт нам бюджет </w:t>
+      </w:r>
+      <w:proofErr w:type="gramStart"/>
+      <w:r>
+        <w:t>моно звука</w:t>
+      </w:r>
+      <w:proofErr w:type="gramEnd"/>
+      <w:r>
+        <w:t xml:space="preserve"> для обоих </w:t>
+      </w:r>
+      <w:proofErr w:type="spellStart"/>
+      <w:r>
+        <w:t>луперов</w:t>
+      </w:r>
+      <w:proofErr w:type="spellEnd"/>
+      <w:r>
+        <w:t xml:space="preserve"> (48</w:t>
+      </w:r>
+      <w:proofErr w:type="spellStart"/>
+      <w:r>
+        <w:rPr>
+          <w:lang w:val="en-US"/>
+        </w:rPr>
+        <w:t>khz</w:t>
+      </w:r>
+      <w:proofErr w:type="spellEnd"/>
+      <w:r>
+        <w:t xml:space="preserve">, 25 </w:t>
+      </w:r>
+      <w:r>
+        <w:t>мегабайт</w:t>
+      </w:r>
+      <w:r>
+        <w:t>, данные упакованы</w:t>
+      </w:r>
+      <w:r>
+        <w:t>):</w:t>
+      </w:r>
+    </w:p>
+    <w:p>
+      <w:pPr>
+        <w:pStyle w:val="a3"/>
+        <w:rPr>
+          <w:lang w:val="en-US"/>
+        </w:rPr>
+      </w:pPr>
+      <w:r>
+        <w:rPr>
+          <w:lang w:val="en-US"/>
+        </w:rPr>
+        <w:t>16-bit:</w:t>
+      </w:r>
+      <w:r>
+        <w:rPr>
+          <w:lang w:val="en-US"/>
+        </w:rPr>
+        <w:t xml:space="preserve"> </w:t>
+      </w:r>
+      <w:r>
+        <w:rPr>
+          <w:lang w:val="en-US"/>
+        </w:rPr>
+        <w:t xml:space="preserve">~4 min 20 sec </w:t>
+      </w:r>
+    </w:p>
+    <w:p>
+      <w:pPr>
+        <w:pStyle w:val="a3"/>
+        <w:rPr>
+          <w:lang w:val="en-US"/>
+        </w:rPr>
+      </w:pPr>
+      <w:r>
+        <w:rPr>
+          <w:lang w:val="en-US"/>
+        </w:rPr>
+        <w:t xml:space="preserve">24-bit: ~2 min 54 sec </w:t>
+      </w:r>
+    </w:p>
+    <w:p>
+      <w:pPr>
+        <w:pStyle w:val="a3"/>
+      </w:pPr>
+      <w:r>
+        <w:rPr>
+          <w:lang w:val="en-US"/>
+        </w:rPr>
+        <w:t>32-bit: ~2 min 10 sec</w:t>
+      </w:r>
+    </w:p>
+    <w:p>
+      <w:pPr>
+        <w:pStyle w:val="a3"/>
+        <w:numPr>
+          <w:ilvl w:val="0"/>
+          <w:numId w:val="3"/>
+        </w:numPr>
+      </w:pPr>
+      <w:r>
+        <w:t>То есть, в самом худшем случае – 2 стерео-</w:t>
+      </w:r>
+      <w:proofErr w:type="spellStart"/>
+      <w:r>
+        <w:t>лупера</w:t>
+      </w:r>
+      <w:proofErr w:type="spellEnd"/>
+      <w:r>
+        <w:t xml:space="preserve"> – имеем макс. длину лупа:</w:t>
+      </w:r>
+    </w:p>
+    <w:p>
+      <w:pPr>
+        <w:pStyle w:val="a3"/>
+        <w:rPr>
+          <w:lang w:val="en-US"/>
+        </w:rPr>
+      </w:pPr>
+      <w:r>
+        <w:rPr>
+          <w:lang w:val="en-US"/>
+        </w:rPr>
+        <w:t>16-bit: ~</w:t>
+      </w:r>
+      <w:r>
+        <w:rPr>
+          <w:lang w:val="en-US"/>
+        </w:rPr>
+        <w:t>1</w:t>
+      </w:r>
+      <w:r>
+        <w:rPr>
+          <w:lang w:val="en-US"/>
+        </w:rPr>
+        <w:t xml:space="preserve"> min </w:t>
+      </w:r>
+      <w:r>
+        <w:rPr>
+          <w:lang w:val="en-US"/>
+        </w:rPr>
+        <w:t>5</w:t>
+      </w:r>
+      <w:r>
+        <w:rPr>
+          <w:lang w:val="en-US"/>
+        </w:rPr>
+        <w:t xml:space="preserve"> sec </w:t>
+      </w:r>
+    </w:p>
+    <w:p>
+      <w:pPr>
+        <w:pStyle w:val="a3"/>
+        <w:rPr>
+          <w:lang w:val="en-US"/>
+        </w:rPr>
+      </w:pPr>
+      <w:r>
+        <w:rPr>
+          <w:lang w:val="en-US"/>
+        </w:rPr>
+        <w:t>24-bit: ~</w:t>
+      </w:r>
+      <w:r>
+        <w:rPr>
+          <w:lang w:val="en-US"/>
+        </w:rPr>
+        <w:t>43</w:t>
+      </w:r>
+      <w:r>
+        <w:rPr>
+          <w:lang w:val="en-US"/>
+        </w:rPr>
+        <w:t xml:space="preserve"> sec </w:t>
+      </w:r>
+    </w:p>
+    <w:p>
+      <w:pPr>
+        <w:pStyle w:val="a3"/>
+        <w:rPr>
+          <w:lang w:val="en-US"/>
+        </w:rPr>
+      </w:pPr>
+      <w:r>
+        <w:rPr>
+          <w:lang w:val="en-US"/>
+        </w:rPr>
+        <w:t>32-bit: ~</w:t>
+      </w:r>
+      <w:r>
+        <w:rPr>
+          <w:lang w:val="en-US"/>
+        </w:rPr>
+        <w:t>32</w:t>
+      </w:r>
+      <w:r>
+        <w:rPr>
+          <w:lang w:val="en-US"/>
+        </w:rPr>
+        <w:t>sec</w:t>
+      </w:r>
+    </w:p>
+    <w:p>
+      <w:pPr>
+        <w:pStyle w:val="a3"/>
+        <w:numPr>
+          <w:ilvl w:val="0"/>
+          <w:numId w:val="3"/>
+        </w:numPr>
+      </w:pPr>
+      <w:r>
+        <w:t xml:space="preserve">При самом низком музыкальном </w:t>
+      </w:r>
+      <w:r>
+        <w:rPr>
+          <w:lang w:val="en-US"/>
+        </w:rPr>
+        <w:t>BPM</w:t>
+      </w:r>
+      <w:r>
+        <w:t xml:space="preserve">=40 </w:t>
+      </w:r>
+      <w:r>
+        <w:t xml:space="preserve">длина 4 баров </w:t>
+      </w:r>
+      <w:r>
+        <w:t>= 24</w:t>
+      </w:r>
+      <w:r>
+        <w:t>сек, так что на 24-</w:t>
+      </w:r>
+      <w:r>
+        <w:rPr>
+          <w:lang w:val="en-US"/>
+        </w:rPr>
+        <w:t>bit</w:t>
+      </w:r>
+      <w:r>
+        <w:t xml:space="preserve"> звуке будем иметь двойной запас при </w:t>
+      </w:r>
+      <w:r>
+        <w:rPr>
+          <w:lang w:val="en-US"/>
+        </w:rPr>
+        <w:t>BPM</w:t>
+      </w:r>
+      <w:r>
+        <w:t xml:space="preserve">=45. </w:t>
+      </w:r>
+      <w:r>
+        <w:t>И на 32-</w:t>
+      </w:r>
+      <w:r>
+        <w:rPr>
+          <w:lang w:val="en-US"/>
+        </w:rPr>
+        <w:t xml:space="preserve">bit </w:t>
+      </w:r>
+      <w:r>
+        <w:t xml:space="preserve">звуке будет двойной запас при </w:t>
+      </w:r>
+      <w:r>
+        <w:rPr>
+          <w:lang w:val="en-US"/>
+        </w:rPr>
+        <w:t>BPM=60.</w:t>
+      </w:r>
+    </w:p>
+    <w:p>
+      <w:pPr>
+        <w:pStyle w:val="a3"/>
+        <w:numPr>
+          <w:ilvl w:val="0"/>
+          <w:numId w:val="3"/>
+        </w:numPr>
+      </w:pPr>
+      <w:r>
+        <w:t xml:space="preserve">Передача </w:t>
+      </w:r>
+      <w:r>
+        <w:t xml:space="preserve">25 </w:t>
+      </w:r>
+      <w:r>
+        <w:t xml:space="preserve">мегабайт по каналу </w:t>
+      </w:r>
+      <w:r>
+        <w:rPr>
+          <w:lang w:val="en-US"/>
+        </w:rPr>
+        <w:t>SPI</w:t>
+      </w:r>
+      <w:r>
+        <w:t xml:space="preserve"> </w:t>
+      </w:r>
+      <w:r>
+        <w:rPr>
+          <w:lang w:val="en-US"/>
+        </w:rPr>
+        <w:t>c</w:t>
+      </w:r>
+      <w:r>
+        <w:t xml:space="preserve"> </w:t>
+      </w:r>
+      <w:r>
+        <w:t xml:space="preserve">выделенной для этого полосой 80 мегабит займёт </w:t>
+      </w:r>
+      <w:r>
+        <w:t xml:space="preserve">~2.5 </w:t>
+      </w:r>
+      <w:r>
+        <w:t>сек</w:t>
+      </w:r>
+      <w:r>
+        <w:t xml:space="preserve">. При этом по </w:t>
+      </w:r>
+      <w:r>
+        <w:rPr>
+          <w:lang w:val="en-US"/>
+        </w:rPr>
+        <w:t>SPI</w:t>
+      </w:r>
+      <w:r>
+        <w:t xml:space="preserve"> 96</w:t>
+      </w:r>
+      <w:r>
+        <w:rPr>
+          <w:lang w:val="en-US"/>
+        </w:rPr>
+        <w:t>MHz</w:t>
+      </w:r>
+      <w:r>
+        <w:t xml:space="preserve"> </w:t>
+      </w:r>
+      <w:r>
+        <w:t>может ещё одновременно передаваться 4 канала рекордера.</w:t>
+      </w:r>
+    </w:p>
+    <w:p>
+      <w:pPr>
+        <w:pStyle w:val="a3"/>
+        <w:numPr>
+          <w:ilvl w:val="0"/>
+          <w:numId w:val="3"/>
+        </w:numPr>
+      </w:pPr>
+      <w:r>
+        <w:t xml:space="preserve">Размер ОЗУ </w:t>
+      </w:r>
+      <w:r>
+        <w:rPr>
+          <w:lang w:val="en-US"/>
+        </w:rPr>
+        <w:t>GUI</w:t>
+      </w:r>
+      <w:r>
+        <w:t xml:space="preserve"> </w:t>
+      </w:r>
+      <w:r>
+        <w:t xml:space="preserve">тоже составляет 128 мегабайт, так что туда спокойно поместится до 4 сохранений </w:t>
+      </w:r>
+      <w:proofErr w:type="spellStart"/>
+      <w:r>
+        <w:t>лупера</w:t>
+      </w:r>
+      <w:proofErr w:type="spellEnd"/>
+      <w:r>
+        <w:t xml:space="preserve">. После этого нужно будет ждать сохранения этого буфера на </w:t>
+      </w:r>
+      <w:r>
+        <w:rPr>
+          <w:lang w:val="en-US"/>
+        </w:rPr>
+        <w:t>SD</w:t>
+      </w:r>
+      <w:r>
+        <w:t>-</w:t>
+      </w:r>
+      <w:r>
+        <w:t xml:space="preserve">карту. </w:t>
+      </w:r>
+    </w:p>
+    <w:p/>
+    <w:p/>
+    <w:p>
+      <w:pPr>
+        <w:pStyle w:val="a3"/>
+      </w:pPr>
+    </w:p>
+    <w:p>
+      <w:pPr>
+        <w:pStyle w:val="a3"/>
       </w:pPr>
     </w:p>
     <w:sectPr>
@@ -21,7 +610,7 @@
 </file>
 
 <file path=word/numbering.xml><?xml version="1.0" encoding="utf-8"?>
-<w:numbering xmlns:wpc="http://schemas.microsoft.com/office/word/2010/wordprocessingCanvas" xmlns:cx="http://schemas.microsoft.com/office/drawing/2014/chartex" xmlns:cx1="http://schemas.microsoft.com/office/drawing/2015/9/8/chartex" xmlns:cx2="http://schemas.microsoft.com/office/drawing/2015/10/21/chartex" xmlns:cx3="http://schemas.microsoft.com/office/drawing/2016/5/9/chartex" xmlns:cx4="http://schemas.microsoft.com/office/drawing/2016/5/10/chartex" xmlns:cx5="http://schemas.microsoft.com/office/drawing/2016/5/11/chartex" xmlns:cx6="http://schemas.microsoft.com/office/drawing/2016/5/12/chartex" xmlns:cx7="http://schemas.microsoft.com/office/drawing/2016/5/13/chartex" xmlns:cx8="http://schemas.microsoft.com/office/drawing/2016/5/14/chartex" xmlns:mc="http://schemas.openxmlformats.org/markup-compatibility/2006" xmlns:aink="http://schemas.microsoft.com/office/drawing/2016/ink" xmlns:am3d="http://schemas.microsoft.com/office/drawing/2017/model3d" xmlns:o="urn:schemas-microsoft-com:office:office" xmlns:r="http://schemas.openxmlformats.org/officeDocument/2006/relationships" xmlns:m="http://schemas.openxmlformats.org/officeDocument/2006/math" xmlns:v="urn:schemas-microsoft-com:vml" xmlns:wp14="http://schemas.microsoft.com/office/word/2010/wordprocessingDrawing" xmlns:wp="http://schemas.openxmlformats.org/drawingml/2006/wordprocessingDrawing" xmlns:w10="urn:schemas-microsoft-com:office:word" xmlns:w="http://schemas.openxmlformats.org/wordprocessingml/2006/main" xmlns:w14="http://schemas.microsoft.com/office/word/2010/wordml" xmlns:w15="http://schemas.microsoft.com/office/word/2012/wordml" xmlns:w16cex="http://schemas.microsoft.com/office/word/2018/wordml/cex" xmlns:w16cid="http://schemas.microsoft.com/office/word/2016/wordml/cid" xmlns:w16="http://schemas.microsoft.com/office/word/2018/wordml" xmlns:w16sdtdh="http://schemas.microsoft.com/office/word/2020/wordml/sdtdatahash" xmlns:w16se="http://schemas.microsoft.com/office/word/2015/wordml/symex" xmlns:wpg="http://schemas.microsoft.com/office/word/2010/wordprocessingGroup" xmlns:wpi="http://schemas.microsoft.com/office/word/2010/wordprocessingInk" xmlns:wne="http://schemas.microsoft.com/office/word/2006/wordml" xmlns:wps="http://schemas.microsoft.com/office/word/2010/wordprocessingShape" mc:Ignorable="w14 w15 w16se w16cid w16 w16cex w16sdtdh wp14">
+<w:numbering xmlns:wpc="http://schemas.microsoft.com/office/word/2010/wordprocessingCanvas" xmlns:cx="http://schemas.microsoft.com/office/drawing/2014/chartex" xmlns:cx1="http://schemas.microsoft.com/office/drawing/2015/9/8/chartex" xmlns:cx2="http://schemas.microsoft.com/office/drawing/2015/10/21/chartex" xmlns:cx3="http://schemas.microsoft.com/office/drawing/2016/5/9/chartex" xmlns:cx4="http://schemas.microsoft.com/office/drawing/2016/5/10/chartex" xmlns:cx5="http://schemas.microsoft.com/office/drawing/2016/5/11/chartex" xmlns:cx6="http://schemas.microsoft.com/office/drawing/2016/5/12/chartex" xmlns:cx7="http://schemas.microsoft.com/office/drawing/2016/5/13/chartex" xmlns:cx8="http://schemas.microsoft.com/office/drawing/2016/5/14/chartex" xmlns:mc="http://schemas.openxmlformats.org/markup-compatibility/2006" xmlns:aink="http://schemas.microsoft.com/office/drawing/2016/ink" xmlns:am3d="http://schemas.microsoft.com/office/drawing/2017/model3d" xmlns:o="urn:schemas-microsoft-com:office:office" xmlns:oel="http://schemas.microsoft.com/office/2019/extlst" xmlns:r="http://schemas.openxmlformats.org/officeDocument/2006/relationships" xmlns:m="http://schemas.openxmlformats.org/officeDocument/2006/math" xmlns:v="urn:schemas-microsoft-com:vml" xmlns:wp14="http://schemas.microsoft.com/office/word/2010/wordprocessingDrawing" xmlns:wp="http://schemas.openxmlformats.org/drawingml/2006/wordprocessingDrawing" xmlns:w10="urn:schemas-microsoft-com:office:word" xmlns:w="http://schemas.openxmlformats.org/wordprocessingml/2006/main" xmlns:w14="http://schemas.microsoft.com/office/word/2010/wordml" xmlns:w15="http://schemas.microsoft.com/office/word/2012/wordml" xmlns:w16cex="http://schemas.microsoft.com/office/word/2018/wordml/cex" xmlns:w16cid="http://schemas.microsoft.com/office/word/2016/wordml/cid" xmlns:w16="http://schemas.microsoft.com/office/word/2018/wordml" xmlns:w16du="http://schemas.microsoft.com/office/word/2023/wordml/word16du" xmlns:w16sdtdh="http://schemas.microsoft.com/office/word/2020/wordml/sdtdatahash" xmlns:w16sdtfl="http://schemas.microsoft.com/office/word/2024/wordml/sdtformatlock" xmlns:w16se="http://schemas.microsoft.com/office/word/2015/wordml/symex" xmlns:wpg="http://schemas.microsoft.com/office/word/2010/wordprocessingGroup" xmlns:wpi="http://schemas.microsoft.com/office/word/2010/wordprocessingInk" xmlns:wne="http://schemas.microsoft.com/office/word/2006/wordml" xmlns:wps="http://schemas.microsoft.com/office/word/2010/wordprocessingShape" mc:Ignorable="w14 w15 w16se w16cid w16 w16cex w16sdtdh w16sdtfl w16du wp14">
   <w:abstractNum w:abstractNumId="0" w15:restartNumberingAfterBreak="0">
     <w:nsid w:val="1DA90D6E"/>
     <w:multiLevelType w:val="hybridMultilevel"/>
@@ -246,17 +835,133 @@
       </w:rPr>
     </w:lvl>
   </w:abstractNum>
-  <w:num w:numId="1">
+  <w:abstractNum w:abstractNumId="2" w15:restartNumberingAfterBreak="0">
+    <w:nsid w:val="7E9A3330"/>
+    <w:multiLevelType w:val="hybridMultilevel"/>
+    <w:tmpl w:val="E8E4248A"/>
+    <w:lvl w:ilvl="0" w:tplc="04190001">
+      <w:start w:val="1"/>
+      <w:numFmt w:val="bullet"/>
+      <w:lvlText w:val=""/>
+      <w:lvlJc w:val="left"/>
+      <w:pPr>
+        <w:ind w:left="720" w:hanging="360"/>
+      </w:pPr>
+      <w:rPr>
+        <w:rFonts w:ascii="Symbol" w:hAnsi="Symbol" w:hint="default"/>
+      </w:rPr>
+    </w:lvl>
+    <w:lvl w:ilvl="1" w:tplc="04190003" w:tentative="1">
+      <w:start w:val="1"/>
+      <w:numFmt w:val="bullet"/>
+      <w:lvlText w:val="o"/>
+      <w:lvlJc w:val="left"/>
+      <w:pPr>
+        <w:ind w:left="1440" w:hanging="360"/>
+      </w:pPr>
+      <w:rPr>
+        <w:rFonts w:ascii="Courier New" w:hAnsi="Courier New" w:cs="Courier New" w:hint="default"/>
+      </w:rPr>
+    </w:lvl>
+    <w:lvl w:ilvl="2" w:tplc="04190005" w:tentative="1">
+      <w:start w:val="1"/>
+      <w:numFmt w:val="bullet"/>
+      <w:lvlText w:val=""/>
+      <w:lvlJc w:val="left"/>
+      <w:pPr>
+        <w:ind w:left="2160" w:hanging="360"/>
+      </w:pPr>
+      <w:rPr>
+        <w:rFonts w:ascii="Wingdings" w:hAnsi="Wingdings" w:hint="default"/>
+      </w:rPr>
+    </w:lvl>
+    <w:lvl w:ilvl="3" w:tplc="04190001" w:tentative="1">
+      <w:start w:val="1"/>
+      <w:numFmt w:val="bullet"/>
+      <w:lvlText w:val=""/>
+      <w:lvlJc w:val="left"/>
+      <w:pPr>
+        <w:ind w:left="2880" w:hanging="360"/>
+      </w:pPr>
+      <w:rPr>
+        <w:rFonts w:ascii="Symbol" w:hAnsi="Symbol" w:hint="default"/>
+      </w:rPr>
+    </w:lvl>
+    <w:lvl w:ilvl="4" w:tplc="04190003" w:tentative="1">
+      <w:start w:val="1"/>
+      <w:numFmt w:val="bullet"/>
+      <w:lvlText w:val="o"/>
+      <w:lvlJc w:val="left"/>
+      <w:pPr>
+        <w:ind w:left="3600" w:hanging="360"/>
+      </w:pPr>
+      <w:rPr>
+        <w:rFonts w:ascii="Courier New" w:hAnsi="Courier New" w:cs="Courier New" w:hint="default"/>
+      </w:rPr>
+    </w:lvl>
+    <w:lvl w:ilvl="5" w:tplc="04190005" w:tentative="1">
+      <w:start w:val="1"/>
+      <w:numFmt w:val="bullet"/>
+      <w:lvlText w:val=""/>
+      <w:lvlJc w:val="left"/>
+      <w:pPr>
+        <w:ind w:left="4320" w:hanging="360"/>
+      </w:pPr>
+      <w:rPr>
+        <w:rFonts w:ascii="Wingdings" w:hAnsi="Wingdings" w:hint="default"/>
+      </w:rPr>
+    </w:lvl>
+    <w:lvl w:ilvl="6" w:tplc="04190001" w:tentative="1">
+      <w:start w:val="1"/>
+      <w:numFmt w:val="bullet"/>
+      <w:lvlText w:val=""/>
+      <w:lvlJc w:val="left"/>
+      <w:pPr>
+        <w:ind w:left="5040" w:hanging="360"/>
+      </w:pPr>
+      <w:rPr>
+        <w:rFonts w:ascii="Symbol" w:hAnsi="Symbol" w:hint="default"/>
+      </w:rPr>
+    </w:lvl>
+    <w:lvl w:ilvl="7" w:tplc="04190003" w:tentative="1">
+      <w:start w:val="1"/>
+      <w:numFmt w:val="bullet"/>
+      <w:lvlText w:val="o"/>
+      <w:lvlJc w:val="left"/>
+      <w:pPr>
+        <w:ind w:left="5760" w:hanging="360"/>
+      </w:pPr>
+      <w:rPr>
+        <w:rFonts w:ascii="Courier New" w:hAnsi="Courier New" w:cs="Courier New" w:hint="default"/>
+      </w:rPr>
+    </w:lvl>
+    <w:lvl w:ilvl="8" w:tplc="04190005" w:tentative="1">
+      <w:start w:val="1"/>
+      <w:numFmt w:val="bullet"/>
+      <w:lvlText w:val=""/>
+      <w:lvlJc w:val="left"/>
+      <w:pPr>
+        <w:ind w:left="6480" w:hanging="360"/>
+      </w:pPr>
+      <w:rPr>
+        <w:rFonts w:ascii="Wingdings" w:hAnsi="Wingdings" w:hint="default"/>
+      </w:rPr>
+    </w:lvl>
+  </w:abstractNum>
+  <w:num w:numId="1" w16cid:durableId="41949764">
     <w:abstractNumId w:val="0"/>
   </w:num>
-  <w:num w:numId="2">
+  <w:num w:numId="2" w16cid:durableId="1464930871">
     <w:abstractNumId w:val="1"/>
+  </w:num>
+  <w:num w:numId="3" w16cid:durableId="1565792080">
+    <w:abstractNumId w:val="2"/>
   </w:num>
 </w:numbering>
 </file>
 
 <file path=word/styles.xml><?xml version="1.0" encoding="utf-8"?>
-<w:styles xmlns:mc="http://schemas.openxmlformats.org/markup-compatibility/2006" xmlns:r="http://schemas.openxmlformats.org/officeDocument/2006/relationships" xmlns:w="http://schemas.openxmlformats.org/wordprocessingml/2006/main" xmlns:w14="http://schemas.microsoft.com/office/word/2010/wordml" xmlns:w15="http://schemas.microsoft.com/office/word/2012/wordml" xmlns:w16cex="http://schemas.microsoft.com/office/word/2018/wordml/cex" xmlns:w16cid="http://schemas.microsoft.com/office/word/2016/wordml/cid" xmlns:w16="http://schemas.microsoft.com/office/word/2018/wordml" xmlns:w16sdtdh="http://schemas.microsoft.com/office/word/2020/wordml/sdtdatahash" xmlns:w16se="http://schemas.microsoft.com/office/word/2015/wordml/symex" mc:Ignorable="w14 w15 w16se w16cid w16 w16cex w16sdtdh">
+<w:styles xmlns:mc="http://schemas.openxmlformats.org/markup-compatibility/2006" xmlns:r="http://schemas.openxmlformats.org/officeDocument/2006/relationships" xmlns:w="http://schemas.openxmlformats.org/wordprocessingml/2006/main" xmlns:w14="http://schemas.microsoft.com/office/word/2010/wordml" xmlns:w15="http://schemas.microsoft.com/office/word/2012/wordml" xmlns:w16cex="http://schemas.microsoft.com/office/word/2018/wordml/cex" xmlns:w16cid="http://schemas.microsoft.com/office/word/2016/wordml/cid" xmlns:w16="http://schemas.microsoft.com/office/word/2018/wordml" xmlns:w16du="http://schemas.microsoft.com/office/word/2023/wordml/word16du" xmlns:w16sdtdh="http://schemas.microsoft.com/office/word/2020/wordml/sdtdatahash" xmlns:w16sdtfl="http://schemas.microsoft.com/office/word/2024/wordml/sdtformatlock" xmlns:w16se="http://schemas.microsoft.com/office/word/2015/wordml/symex" mc:Ignorable="w14 w15 w16se w16cid w16 w16cex w16sdtdh w16sdtfl w16du">
   <w:docDefaults>
     <w:rPrDefault>
       <w:rPr>
@@ -650,17 +1355,16 @@
     <w:lsdException w:name="Unresolved Mention" w:semiHidden="1" w:unhideWhenUsed="1"/>
     <w:lsdException w:name="Smart Link" w:semiHidden="1" w:unhideWhenUsed="1"/>
   </w:latentStyles>
-  <w:style w:type="paragraph" w:default="1" w:styleId="Normal">
+  <w:style w:type="paragraph" w:default="1" w:styleId="a">
     <w:name w:val="Normal"/>
     <w:qFormat/>
   </w:style>
-  <w:style w:type="character" w:default="1" w:styleId="DefaultParagraphFont">
+  <w:style w:type="character" w:default="1" w:styleId="a0">
     <w:name w:val="Default Paragraph Font"/>
     <w:uiPriority w:val="1"/>
-    <w:semiHidden/>
     <w:unhideWhenUsed/>
   </w:style>
-  <w:style w:type="table" w:default="1" w:styleId="TableNormal">
+  <w:style w:type="table" w:default="1" w:styleId="a1">
     <w:name w:val="Normal Table"/>
     <w:uiPriority w:val="99"/>
     <w:semiHidden/>
@@ -675,15 +1379,15 @@
       </w:tblCellMar>
     </w:tblPr>
   </w:style>
-  <w:style w:type="numbering" w:default="1" w:styleId="NoList">
+  <w:style w:type="numbering" w:default="1" w:styleId="a2">
     <w:name w:val="No List"/>
     <w:uiPriority w:val="99"/>
     <w:semiHidden/>
     <w:unhideWhenUsed/>
   </w:style>
-  <w:style w:type="paragraph" w:styleId="ListParagraph">
+  <w:style w:type="paragraph" w:styleId="a3">
     <w:name w:val="List Paragraph"/>
-    <w:basedOn w:val="Normal"/>
+    <w:basedOn w:val="a"/>
     <w:uiPriority w:val="34"/>
     <w:qFormat/>
     <w:rsid w:val="00D02B99"/>
@@ -692,9 +1396,9 @@
       <w:contextualSpacing/>
     </w:pPr>
   </w:style>
-  <w:style w:type="character" w:styleId="Hyperlink">
+  <w:style w:type="character" w:styleId="a4">
     <w:name w:val="Hyperlink"/>
-    <w:basedOn w:val="DefaultParagraphFont"/>
+    <w:basedOn w:val="a0"/>
     <w:uiPriority w:val="99"/>
     <w:unhideWhenUsed/>
     <w:rsid w:val="001F6A86"/>
@@ -703,9 +1407,9 @@
       <w:u w:val="single"/>
     </w:rPr>
   </w:style>
-  <w:style w:type="character" w:styleId="UnresolvedMention">
+  <w:style w:type="character" w:styleId="a5">
     <w:name w:val="Unresolved Mention"/>
-    <w:basedOn w:val="DefaultParagraphFont"/>
+    <w:basedOn w:val="a0"/>
     <w:uiPriority w:val="99"/>
     <w:semiHidden/>
     <w:unhideWhenUsed/>
@@ -713,6 +1417,17 @@
     <w:rPr>
       <w:color w:val="605E5C"/>
       <w:shd w:val="clear" w:color="auto" w:fill="E1DFDD"/>
+    </w:rPr>
+  </w:style>
+  <w:style w:type="character" w:styleId="a6">
+    <w:name w:val="Strong"/>
+    <w:basedOn w:val="a0"/>
+    <w:uiPriority w:val="22"/>
+    <w:qFormat/>
+    <w:rsid w:val="00AE68C3"/>
+    <w:rPr>
+      <w:b/>
+      <w:bCs/>
     </w:rPr>
   </w:style>
 </w:styles>

</xml_diff>